<commit_message>
docs: mining LLM = tiered + benchmark-selected, not frontier-default
Value-tier models (DeepSeek/Kimi/GLM/Qwen) for bulk extraction; frontier
tier for hard slices/verification; open-weights self-host for air-gapped
sites. Phase-0 benchmark decides defaults.

Co-Authored-By: Claude Fable 5 <noreply@anthropic.com>
</commit_message>
<xml_diff>
--- a/proposals/business-rules-platform-design-review.en.docx
+++ b/proposals/business-rules-platform-design-review.en.docx
@@ -1649,7 +1649,7 @@
           <w:sz w:val="22"/>
           <w:szCs w:val="22"/>
         </w:rPr>
-        <w:t xml:space="preserve">Every runtime component is open-source — the platform itself carries no third-party license fees. AI is used only in the extraction step (drafting candidate rules for human review), on a usage-based API that can be swapped per site's policy.</w:t>
+        <w:t xml:space="preserve">Every runtime component is open-source — the platform itself carries no third-party license fees. AI is used only in the extraction step (drafting candidate rules for human review). The extraction model is deliberately not fixed: bulk extraction is high-volume, repetitive work where cost-efficient models excel, so we benchmark candidate models on your real sample code in Phase 0 and select by measured accuracy per cost — and for closed environments, open-weights models can run fully on-premise.</w:t>
       </w:r>
     </w:p>
     <w:tbl>
@@ -1942,7 +1942,7 @@
                 <w:sz w:val="20"/>
                 <w:szCs w:val="20"/>
               </w:rPr>
-              <w:t xml:space="preserve">Anthropic Claude (provider swappable)</w:t>
+              <w:t xml:space="preserve">Tiered LLMs, selected by benchmark (e.g., DeepSeek / Kimi / GLM / Qwen for bulk work; frontier models for hard cases) — fully swappable per site policy</w:t>
             </w:r>
           </w:p>
         </w:tc>
@@ -1968,7 +1968,7 @@
                 <w:sz w:val="20"/>
                 <w:szCs w:val="20"/>
               </w:rPr>
-              <w:t xml:space="preserve">Reads the located code and drafts candidate rules — always human-reviewed, never writes production code</w:t>
+              <w:t xml:space="preserve">Reads the located code and drafts candidate rules — always human-reviewed, never writes production code. Open-weights options can run fully on-premise for closed environments</w:t>
             </w:r>
           </w:p>
         </w:tc>
@@ -1994,7 +1994,7 @@
                 <w:sz w:val="20"/>
                 <w:szCs w:val="20"/>
               </w:rPr>
-              <w:t xml:space="preserve">Commercial API</w:t>
+              <w:t xml:space="preserve">API / open-weights</w:t>
             </w:r>
           </w:p>
         </w:tc>

</xml_diff>